<commit_message>
Fix MessageSellerButton text based on book type
</commit_message>
<xml_diff>
--- a/ReadCycle-Learn, Lend, and Reuse — the Smart Way.docx
+++ b/ReadCycle-Learn, Lend, and Reuse — the Smart Way.docx
@@ -2511,8 +2511,6 @@
         <w:jc w:val="both"/>
         <w:rPr>
           <w:rFonts w:ascii="Times New Roman" w:eastAsia="Times New Roman" w:hAnsi="Times New Roman" w:cs="Times New Roman"/>
-          <w:b/>
-          <w:bCs/>
           <w:sz w:val="28"/>
           <w:szCs w:val="28"/>
         </w:rPr>
@@ -3450,7 +3448,7 @@
           <w:szCs w:val="28"/>
         </w:rPr>
         <w:drawing>
-          <wp:inline distT="0" distB="0" distL="0" distR="0" wp14:anchorId="0DCA0A51" wp14:editId="42F0B9EA">
+          <wp:inline distT="0" distB="0" distL="0" distR="0" wp14:anchorId="0DCA0A51" wp14:editId="21C4A175">
             <wp:extent cx="5731510" cy="852170"/>
             <wp:effectExtent l="0" t="0" r="2540" b="5080"/>
             <wp:docPr id="1" name="Picture 1" descr="A white rectangular object with black text&#10;&#10;AI-generated content may be incorrect."/>
@@ -14453,7 +14451,15 @@
         <w:t>Automatic status updates, where the system dynamically updates the book status (available</w:t>
       </w:r>
       <w:r>
-        <w:t>, sold, rented, or swapped) based on transaction activities.</w:t>
+        <w:t xml:space="preserve">, </w:t>
+      </w:r>
+      <w:r>
+        <w:rPr>
+          <w:rFonts w:ascii="Times New Roman" w:hAnsi="Times New Roman" w:cs="Times New Roman"/>
+          <w:sz w:val="28"/>
+          <w:szCs w:val="28"/>
+        </w:rPr>
+        <w:t>sold, rented, or swapped) based on transaction activities.</w:t>
       </w:r>
     </w:p>
     <w:p>

</xml_diff>